<commit_message>
feat: upgrade research agent system v3.0, presentation archetypes, and mermaid vector diagram pdf pipeline
</commit_message>
<xml_diff>
--- a/.agents/skills/professional-researcher/examples/sample_arabic_research.docx
+++ b/.agents/skills/professional-researcher/examples/sample_arabic_research.docx
@@ -4,14 +4,14 @@
   <w:body>
     <w:p>
       <w:pPr>
-        <w:spacing w:before="200" w:after="160"/>
+        <w:spacing w:before="120" w:after="160"/>
         <w:bidi/>
         <w:jc w:val="right"/>
       </w:pPr>
       <w:r>
         <w:rPr>
           <w:b/>
-          <w:color w:val="2563EB"/>
+          <w:color w:val="7B7F8A"/>
           <w:sz w:val="19"/>
           <w:rtl/>
           <w:rFonts w:cs="Arial"/>
@@ -44,7 +44,7 @@
       </w:pPr>
       <w:r>
         <w:rPr>
-          <w:color w:val="334155"/>
+          <w:color w:val="353B4C"/>
           <w:sz w:val="26"/>
           <w:rtl/>
           <w:rFonts w:cs="Arial"/>
@@ -282,7 +282,7 @@
       </w:pPr>
       <w:r>
         <w:rPr>
-          <w:color w:val="2563EB"/>
+          <w:color w:val="7B7F8A"/>
           <w:sz w:val="16"/>
         </w:rPr>
         <w:t>――――――――――――――――――――――――――――――――――――――――――――――――――</w:t>
@@ -315,7 +315,7 @@
       </w:pPr>
       <w:r>
         <w:rPr>
-          <w:color w:val="2563EB"/>
+          <w:color w:val="7B7F8A"/>
           <w:sz w:val="20"/>
           <w:rtl/>
           <w:rFonts w:cs="Arial"/>
@@ -332,7 +332,7 @@
       </w:pPr>
       <w:r>
         <w:rPr>
-          <w:color w:val="2563EB"/>
+          <w:color w:val="7B7F8A"/>
           <w:sz w:val="20"/>
           <w:rtl/>
           <w:rFonts w:cs="Arial"/>
@@ -349,7 +349,7 @@
       </w:pPr>
       <w:r>
         <w:rPr>
-          <w:color w:val="2563EB"/>
+          <w:color w:val="7B7F8A"/>
           <w:sz w:val="20"/>
           <w:rtl/>
           <w:rFonts w:cs="Arial"/>
@@ -384,7 +384,7 @@
       <w:r>
         <w:rPr>
           <w:rFonts w:ascii="Arial" w:hAnsi="Arial"/>
-          <w:color w:val="1E293B"/>
+          <w:color w:val="0F172A"/>
           <w:sz w:val="21"/>
           <w:rtl/>
           <w:rFonts w:cs="Arial"/>
@@ -395,7 +395,7 @@
         <w:rPr>
           <w:rFonts w:ascii="Arial" w:hAnsi="Arial"/>
           <w:b/>
-          <w:color w:val="1E293B"/>
+          <w:color w:val="0F172A"/>
           <w:sz w:val="21"/>
           <w:rtl/>
           <w:rFonts w:cs="Arial"/>
@@ -405,7 +405,7 @@
       <w:r>
         <w:rPr>
           <w:rFonts w:ascii="Arial" w:hAnsi="Arial"/>
-          <w:color w:val="1E293B"/>
+          <w:color w:val="0F172A"/>
           <w:sz w:val="21"/>
           <w:rtl/>
           <w:rFonts w:cs="Arial"/>
@@ -416,7 +416,7 @@
         <w:rPr>
           <w:rFonts w:ascii="Arial" w:hAnsi="Arial"/>
           <w:b/>
-          <w:color w:val="1E293B"/>
+          <w:color w:val="0F172A"/>
           <w:sz w:val="21"/>
           <w:rtl/>
           <w:rFonts w:cs="Arial"/>
@@ -426,7 +426,7 @@
       <w:r>
         <w:rPr>
           <w:rFonts w:ascii="Arial" w:hAnsi="Arial"/>
-          <w:color w:val="1E293B"/>
+          <w:color w:val="0F172A"/>
           <w:sz w:val="21"/>
         </w:rPr>
         <w:t>.</w:t>
@@ -516,7 +516,7 @@
       <w:r>
         <w:rPr>
           <w:rFonts w:ascii="Arial" w:hAnsi="Arial"/>
-          <w:color w:val="1E293B"/>
+          <w:color w:val="0F172A"/>
           <w:sz w:val="21"/>
           <w:rtl/>
           <w:rFonts w:cs="Arial"/>
@@ -1520,7 +1520,7 @@
         <w:rPr>
           <w:rFonts w:ascii="Arial" w:hAnsi="Arial"/>
           <w:b/>
-          <w:color w:val="1E293B"/>
+          <w:color w:val="0F172A"/>
           <w:sz w:val="21"/>
           <w:rtl/>
           <w:rFonts w:cs="Arial"/>
@@ -1530,7 +1530,7 @@
       <w:r>
         <w:rPr>
           <w:rFonts w:ascii="Arial" w:hAnsi="Arial"/>
-          <w:color w:val="1E293B"/>
+          <w:color w:val="0F172A"/>
           <w:sz w:val="21"/>
           <w:rtl/>
           <w:rFonts w:cs="Arial"/>
@@ -1550,7 +1550,7 @@
         <w:rPr>
           <w:rFonts w:ascii="Arial" w:hAnsi="Arial"/>
           <w:b/>
-          <w:color w:val="1E293B"/>
+          <w:color w:val="0F172A"/>
           <w:sz w:val="21"/>
           <w:rtl/>
           <w:rFonts w:cs="Arial"/>
@@ -1560,7 +1560,7 @@
       <w:r>
         <w:rPr>
           <w:rFonts w:ascii="Arial" w:hAnsi="Arial"/>
-          <w:color w:val="1E293B"/>
+          <w:color w:val="0F172A"/>
           <w:sz w:val="21"/>
           <w:rtl/>
           <w:rFonts w:cs="Arial"/>
@@ -1580,7 +1580,7 @@
         <w:rPr>
           <w:rFonts w:ascii="Arial" w:hAnsi="Arial"/>
           <w:b/>
-          <w:color w:val="1E293B"/>
+          <w:color w:val="0F172A"/>
           <w:sz w:val="21"/>
           <w:rtl/>
           <w:rFonts w:cs="Arial"/>
@@ -1590,7 +1590,7 @@
       <w:r>
         <w:rPr>
           <w:rFonts w:ascii="Arial" w:hAnsi="Arial"/>
-          <w:color w:val="1E293B"/>
+          <w:color w:val="0F172A"/>
           <w:sz w:val="21"/>
           <w:rtl/>
           <w:rFonts w:cs="Arial"/>
@@ -1669,7 +1669,7 @@
         <w:rPr>
           <w:rFonts w:ascii="Arial" w:hAnsi="Arial"/>
           <w:i/>
-          <w:color w:val="1E293B"/>
+          <w:color w:val="0F172A"/>
           <w:sz w:val="21"/>
           <w:rtl/>
           <w:rFonts w:cs="Arial"/>
@@ -2132,7 +2132,7 @@
     </w:pPr>
     <w:rPr>
       <w:rFonts w:ascii="Arial" w:hAnsi="Arial"/>
-      <w:color w:val="1E293B"/>
+      <w:color w:val="0F172A"/>
       <w:sz w:val="21"/>
     </w:rPr>
   </w:style>
@@ -2226,7 +2226,7 @@
       <w:rFonts w:asciiTheme="majorHAnsi" w:eastAsiaTheme="majorEastAsia" w:hAnsiTheme="majorHAnsi" w:cstheme="majorBidi" w:ascii="Arial" w:hAnsi="Arial"/>
       <w:b/>
       <w:bCs/>
-      <w:color w:val="2563EB"/>
+      <w:color w:val="7B7F8A"/>
       <w:sz w:val="26"/>
       <w:szCs w:val="26"/>
     </w:rPr>
@@ -2250,7 +2250,7 @@
       <w:rFonts w:asciiTheme="majorHAnsi" w:eastAsiaTheme="majorEastAsia" w:hAnsiTheme="majorHAnsi" w:cstheme="majorBidi" w:ascii="Arial" w:hAnsi="Arial"/>
       <w:b/>
       <w:bCs/>
-      <w:color w:val="334155"/>
+      <w:color w:val="353B4C"/>
       <w:sz w:val="22"/>
     </w:rPr>
   </w:style>

</xml_diff>